<commit_message>
Respect marked fields in application form
</commit_message>
<xml_diff>
--- a/assets/活動申請書模板.docx
+++ b/assets/活動申請書模板.docx
@@ -299,6 +299,7 @@
             </w:pPr>
             <w:r>
               <w:rPr>
+                <w:rFonts w:ascii="標楷體" w:eastAsia="標楷體" w:hAnsi="標楷體"/>
                 <w:sz w:val="32"/>
                 <w:szCs w:val="32"/>
               </w:rPr>
@@ -315,6 +316,7 @@
             </w:r>
             <w:r>
               <w:rPr>
+                <w:rFonts w:ascii="標楷體" w:eastAsia="標楷體" w:hAnsi="標楷體"/>
                 <w:sz w:val="32"/>
                 <w:szCs w:val="32"/>
               </w:rPr>
@@ -675,15 +677,7 @@
                 <w:sz w:val="32"/>
                 <w:szCs w:val="32"/>
               </w:rPr>
-              <w:t>負責人</w:t>
-            </w:r>
-            <w:r>
-              <w:rPr>
-                <w:rFonts w:ascii="標楷體" w:eastAsia="標楷體" w:hAnsi="標楷體" w:hint="eastAsia"/>
-                <w:sz w:val="32"/>
-                <w:szCs w:val="32"/>
-              </w:rPr>
-              <w:t>電話</w:t>
+              <w:t>負責人電話</w:t>
             </w:r>
             <w:r>
               <w:rPr>
@@ -2258,10 +2252,21 @@
             </w:pPr>
             <w:r>
               <w:rPr>
-                <w:rFonts w:ascii="標楷體" w:eastAsia="標楷體" w:hAnsi="標楷體" w:cs="標楷體"/>
-                <w:color w:val="000000"/>
-              </w:rPr>
-              <w:t>蔡欣君</w:t>
+                <w:rFonts w:ascii="標楷體" w:eastAsia="標楷體" w:hAnsi="標楷體"/>
+              </w:rPr>
+              <w:t>{{</w:t>
+            </w:r>
+            <w:r>
+              <w:rPr>
+                <w:rFonts w:ascii="標楷體" w:eastAsia="標楷體" w:hAnsi="標楷體" w:hint="eastAsia"/>
+              </w:rPr>
+              <w:t>活動負責人</w:t>
+            </w:r>
+            <w:r>
+              <w:rPr>
+                <w:rFonts w:ascii="標楷體" w:eastAsia="標楷體" w:hAnsi="標楷體"/>
+              </w:rPr>
+              <w:t>}}</w:t>
             </w:r>
           </w:p>
         </w:tc>
@@ -2350,15 +2355,36 @@
                 <w:color w:val="000000"/>
               </w:rPr>
             </w:pPr>
-            <w:proofErr w:type="gramStart"/>
-            <w:r>
-              <w:rPr>
-                <w:rFonts w:ascii="標楷體" w:eastAsia="標楷體" w:hAnsi="標楷體" w:cs="標楷體"/>
-                <w:color w:val="000000"/>
-              </w:rPr>
-              <w:t>耿惠慈</w:t>
-            </w:r>
-            <w:proofErr w:type="gramEnd"/>
+            <w:r>
+              <w:rPr>
+                <w:rFonts w:ascii="標楷體" w:eastAsia="標楷體" w:hAnsi="標楷體"/>
+              </w:rPr>
+              <w:t>{{</w:t>
+            </w:r>
+            <w:r>
+              <w:rPr>
+                <w:rFonts w:ascii="標楷體" w:eastAsia="標楷體" w:hAnsi="標楷體" w:hint="eastAsia"/>
+              </w:rPr>
+              <w:t>活動</w:t>
+            </w:r>
+            <w:r>
+              <w:rPr>
+                <w:rFonts w:ascii="標楷體" w:eastAsia="標楷體" w:hAnsi="標楷體" w:hint="eastAsia"/>
+              </w:rPr>
+              <w:t>副</w:t>
+            </w:r>
+            <w:r>
+              <w:rPr>
+                <w:rFonts w:ascii="標楷體" w:eastAsia="標楷體" w:hAnsi="標楷體" w:hint="eastAsia"/>
+              </w:rPr>
+              <w:t>負責人</w:t>
+            </w:r>
+            <w:r>
+              <w:rPr>
+                <w:rFonts w:ascii="標楷體" w:eastAsia="標楷體" w:hAnsi="標楷體"/>
+              </w:rPr>
+              <w:t>}}</w:t>
+            </w:r>
           </w:p>
         </w:tc>
         <w:tc>
@@ -3617,151 +3643,28 @@
           </w:p>
           <w:p>
             <w:pPr>
-              <w:widowControl/>
-              <w:pBdr>
-                <w:top w:val="nil"/>
-                <w:left w:val="nil"/>
-                <w:bottom w:val="nil"/>
-                <w:right w:val="nil"/>
-                <w:between w:val="nil"/>
-              </w:pBdr>
-              <w:rPr>
-                <w:rFonts w:ascii="標楷體" w:eastAsia="標楷體" w:hAnsi="標楷體" w:cs="標楷體"/>
-                <w:color w:val="000000"/>
-              </w:rPr>
-            </w:pPr>
-            <w:r>
-              <w:rPr>
-                <w:rFonts w:ascii="標楷體" w:eastAsia="標楷體" w:hAnsi="標楷體" w:cs="標楷體"/>
-                <w:color w:val="000000"/>
-              </w:rPr>
-              <w:t>19:35-19:50 破冰活動</w:t>
-            </w:r>
-          </w:p>
-          <w:p>
-            <w:pPr>
-              <w:widowControl/>
-              <w:pBdr>
-                <w:top w:val="nil"/>
-                <w:left w:val="nil"/>
-                <w:bottom w:val="nil"/>
-                <w:right w:val="nil"/>
-                <w:between w:val="nil"/>
-              </w:pBdr>
-              <w:rPr>
-                <w:rFonts w:ascii="標楷體" w:eastAsia="標楷體" w:hAnsi="標楷體" w:cs="標楷體"/>
-                <w:color w:val="000000"/>
-              </w:rPr>
-            </w:pPr>
-            <w:r>
-              <w:rPr>
-                <w:rFonts w:ascii="標楷體" w:eastAsia="標楷體" w:hAnsi="標楷體" w:cs="標楷體"/>
-                <w:color w:val="000000"/>
-              </w:rPr>
-              <w:t>19:50-20:30 點心DIY</w:t>
-            </w:r>
-          </w:p>
-          <w:p>
-            <w:pPr>
-              <w:widowControl/>
-              <w:pBdr>
-                <w:top w:val="nil"/>
-                <w:left w:val="nil"/>
-                <w:bottom w:val="nil"/>
-                <w:right w:val="nil"/>
-                <w:between w:val="nil"/>
-              </w:pBdr>
-              <w:rPr>
-                <w:rFonts w:ascii="標楷體" w:eastAsia="標楷體" w:hAnsi="標楷體" w:cs="標楷體"/>
-                <w:color w:val="000000"/>
-              </w:rPr>
-            </w:pPr>
-            <w:r>
-              <w:rPr>
-                <w:rFonts w:ascii="標楷體" w:eastAsia="標楷體" w:hAnsi="標楷體" w:cs="標楷體"/>
-                <w:color w:val="000000"/>
-              </w:rPr>
-              <w:t>20:30-20:38 介紹</w:t>
-            </w:r>
-            <w:r>
               <w:rPr>
                 <w:rFonts w:ascii="標楷體" w:eastAsia="標楷體" w:hAnsi="標楷體"/>
               </w:rPr>
+            </w:pPr>
+            <w:r>
+              <w:rPr>
+                <w:rFonts w:ascii="標楷體" w:eastAsia="標楷體" w:hAnsi="標楷體"/>
+              </w:rPr>
               <w:t>{{</w:t>
             </w:r>
             <w:r>
               <w:rPr>
                 <w:rFonts w:ascii="標楷體" w:eastAsia="標楷體" w:hAnsi="標楷體" w:hint="eastAsia"/>
               </w:rPr>
-              <w:t>茶</w:t>
+              <w:t>活動進行</w:t>
             </w:r>
             <w:r>
               <w:rPr>
                 <w:rFonts w:ascii="標楷體" w:eastAsia="標楷體" w:hAnsi="標楷體"/>
               </w:rPr>
-              <w:t xml:space="preserve"> </w:t>
-            </w:r>
-            <w:r>
-              <w:rPr>
-                <w:rFonts w:ascii="標楷體" w:eastAsia="標楷體" w:hAnsi="標楷體"/>
-              </w:rPr>
               <w:t>}}</w:t>
             </w:r>
-          </w:p>
-          <w:p>
-            <w:pPr>
-              <w:widowControl/>
-              <w:pBdr>
-                <w:top w:val="nil"/>
-                <w:left w:val="nil"/>
-                <w:bottom w:val="nil"/>
-                <w:right w:val="nil"/>
-                <w:between w:val="nil"/>
-              </w:pBdr>
-              <w:rPr>
-                <w:rFonts w:ascii="標楷體" w:eastAsia="標楷體" w:hAnsi="標楷體" w:cs="標楷體"/>
-                <w:color w:val="000000"/>
-              </w:rPr>
-            </w:pPr>
-            <w:r>
-              <w:rPr>
-                <w:rFonts w:ascii="標楷體" w:eastAsia="標楷體" w:hAnsi="標楷體" w:cs="標楷體"/>
-                <w:color w:val="000000"/>
-              </w:rPr>
-              <w:t>20:38-20:40 大合照</w:t>
-            </w:r>
-          </w:p>
-          <w:p>
-            <w:pPr>
-              <w:widowControl/>
-              <w:pBdr>
-                <w:top w:val="nil"/>
-                <w:left w:val="nil"/>
-                <w:bottom w:val="nil"/>
-                <w:right w:val="nil"/>
-                <w:between w:val="nil"/>
-              </w:pBdr>
-              <w:rPr>
-                <w:rFonts w:ascii="標楷體" w:eastAsia="標楷體" w:hAnsi="標楷體" w:cs="標楷體"/>
-                <w:color w:val="000000"/>
-              </w:rPr>
-            </w:pPr>
-            <w:r>
-              <w:rPr>
-                <w:rFonts w:ascii="標楷體" w:eastAsia="標楷體" w:hAnsi="標楷體" w:cs="標楷體"/>
-                <w:color w:val="000000"/>
-              </w:rPr>
-              <w:t>20:40-20:50</w:t>
-            </w:r>
-            <w:proofErr w:type="gramStart"/>
-            <w:r>
-              <w:rPr>
-                <w:rFonts w:ascii="標楷體" w:eastAsia="標楷體" w:hAnsi="標楷體" w:cs="標楷體"/>
-                <w:color w:val="000000"/>
-              </w:rPr>
-              <w:t>下次社課介紹</w:t>
-            </w:r>
-            <w:proofErr w:type="gramEnd"/>
           </w:p>
           <w:p>
             <w:pPr>
@@ -5334,7 +5237,7 @@
           </w:tcPr>
           <w:p>
             <w:pPr>
-              <w:jc w:val="both"/>
+              <w:jc w:val="center"/>
               <w:rPr>
                 <w:rFonts w:ascii="標楷體" w:eastAsia="標楷體" w:hAnsi="標楷體" w:cs="標楷體"/>
                 <w:color w:val="000000"/>
@@ -5357,13 +5260,6 @@
                 <w:rFonts w:ascii="標楷體" w:eastAsia="標楷體" w:hAnsi="標楷體"/>
               </w:rPr>
               <w:t>}}</w:t>
-            </w:r>
-            <w:r>
-              <w:rPr>
-                <w:rFonts w:ascii="標楷體" w:eastAsia="標楷體" w:hAnsi="標楷體" w:cs="標楷體"/>
-                <w:color w:val="000000"/>
-              </w:rPr>
-              <w:t xml:space="preserve"> </w:t>
             </w:r>
           </w:p>
         </w:tc>

</xml_diff>